<commit_message>
docs(opposables): périmètre langues 4 (FR/EN/FON/YOR) + note datée dans les 3 .docx
Correction ciblée des livrables opposables (CDC, DocTech v2, Specs_UI v2) via le
workflow docx (unpack → edit → pack → validate), sans réécrire les catalogues :

- Périmètre langues corrigé partout : 5 → 4 langues ; Baatɔnum/Dendi retirés,
  anglais/Yorùbá alignés sur FR·EN·FON·YOR (dont suppression de la ligne
  « Dendi » et renommage Bariba→Yorùbá dans la table des langues du CDC).
- Ajout dans chaque document d'une note datée « Mise à jour — juillet 2026 »
  rappelant les compteurs réels du code (127 endpoints REST + 1 WebSocket,
  25 modules, 36 modèles, 53 pages, 19 migrations, 4 langues).

Les détails par module / registres d'écrans restent inchangés (snapshots v2
opposables). Les 3 fichiers passent la validation XSD + redlining.

Co-Authored-By: Claude Fable 5 <noreply@anthropic.com>
Claude-Session: https://claude.ai/code/session_01YJsoUBem9tqX3shKt2EXEk
</commit_message>
<xml_diff>
--- a/docs/fonctionnel/CDC_DigiSante_Mobile_v1.0.docx
+++ b/docs/fonctionnel/CDC_DigiSante_Mobile_v1.0.docx
@@ -2,6 +2,31 @@
 <file path=word/document.xml><?xml version="1.0" encoding="utf-8"?>
 <w:document xmlns:wpc="http://schemas.microsoft.com/office/word/2010/wordprocessingCanvas" xmlns:mc="http://schemas.openxmlformats.org/markup-compatibility/2006" xmlns:o="urn:schemas-microsoft-com:office:office" xmlns:r="http://schemas.openxmlformats.org/officeDocument/2006/relationships" xmlns:m="http://schemas.openxmlformats.org/officeDocument/2006/math" xmlns:v="urn:schemas-microsoft-com:vml" xmlns:wp14="http://schemas.microsoft.com/office/word/2010/wordprocessingDrawing" xmlns:wp="http://schemas.openxmlformats.org/drawingml/2006/wordprocessingDrawing" xmlns:w10="urn:schemas-microsoft-com:office:word" xmlns:w="http://schemas.openxmlformats.org/wordprocessingml/2006/main" xmlns:w14="http://schemas.microsoft.com/office/word/2010/wordml" xmlns:w15="http://schemas.microsoft.com/office/word/2012/wordml" xmlns:wpg="http://schemas.microsoft.com/office/word/2010/wordprocessingGroup" xmlns:wpi="http://schemas.microsoft.com/office/word/2010/wordprocessingInk" xmlns:wne="http://schemas.microsoft.com/office/word/2006/wordml" xmlns:wps="http://schemas.microsoft.com/office/word/2010/wordprocessingShape" xmlns:cx="http://schemas.microsoft.com/office/drawing/2014/chartex" xmlns:cx1="http://schemas.microsoft.com/office/drawing/2015/9/8/chartex" xmlns:cx2="http://schemas.microsoft.com/office/drawing/2015/10/21/chartex" xmlns:cx3="http://schemas.microsoft.com/office/drawing/2016/5/9/chartex" xmlns:cx4="http://schemas.microsoft.com/office/drawing/2016/5/10/chartex" xmlns:cx5="http://schemas.microsoft.com/office/drawing/2016/5/11/chartex" xmlns:cx6="http://schemas.microsoft.com/office/drawing/2016/5/12/chartex" xmlns:cx7="http://schemas.microsoft.com/office/drawing/2016/5/13/chartex" xmlns:cx8="http://schemas.microsoft.com/office/drawing/2016/5/14/chartex" xmlns:aink="http://schemas.microsoft.com/office/drawing/2016/ink" xmlns:am3d="http://schemas.microsoft.com/office/drawing/2017/model3d" xmlns:w16cex="http://schemas.microsoft.com/office/word/2018/wordml/cex" xmlns:w16cid="http://schemas.microsoft.com/office/word/2016/wordml/cid" xmlns:w16="http://schemas.microsoft.com/office/word/2018/wordml" xmlns:w16sdtdh="http://schemas.microsoft.com/office/word/2020/wordml/sdtdatahash" xmlns:w16se="http://schemas.microsoft.com/office/word/2015/wordml/symex" mc:Ignorable="w14 w15 wp14">
   <w:body>
+    <w:p>
+      <w:pPr>
+        <w:pBdr>
+          <w:top w:val="single" w:sz="6" w:space="4" w:color="D9A441"/>
+          <w:bottom w:val="single" w:sz="6" w:space="4" w:color="D9A441"/>
+        </w:pBdr>
+        <w:shd w:val="clear" w:color="auto" w:fill="FBF0DA"/>
+        <w:spacing w:before="120" w:after="160"/>
+      </w:pPr>
+      <w:r>
+        <w:rPr>
+          <w:b/>
+          <w:color w:val="8A5A12"/>
+          <w:sz w:val="18"/>
+        </w:rPr>
+        <w:t xml:space="preserve">[ Mise à jour — juillet 2026 ] </w:t>
+      </w:r>
+      <w:r>
+        <w:rPr>
+          <w:color w:val="8A5A12"/>
+          <w:sz w:val="18"/>
+        </w:rPr>
+        <w:t xml:space="preserve">Périmètre &amp; compteurs réels du code à cette date : 25 modules · 127 endpoints REST + 1 canal WebSocket · 36 modèles Prisma · 53 pages frontend · 4 langues (FR · EN · FON · YOR ; Baatɔnum/Dendi retirés, Yorùbá conservé). Le détail des sections ci-dessous reflète le périmètre initial du cahier des charges.</w:t>
+      </w:r>
+    </w:p>
     <w:p>
       <w:pPr>
         <w:spacing w:after="800" w:before="0"/>
@@ -7474,7 +7499,7 @@
                 <w:sz w:val="20"/>
                 <w:szCs w:val="20"/>
               </w:rPr>
-              <w:t xml:space="preserve">Langues supportées (5 langues)</w:t>
+              <w:t xml:space="preserve">Langues supportées (4 langues)</w:t>
             </w:r>
           </w:p>
         </w:tc>
@@ -8856,7 +8881,7 @@
                 <w:sz w:val="20"/>
                 <w:szCs w:val="20"/>
               </w:rPr>
-              <w:t xml:space="preserve">5 langues : FR, EN, Fon, Bariba, Dendi</w:t>
+              <w:t xml:space="preserve">4 langues : FR, EN, Fon, Yorùbá</w:t>
             </w:r>
           </w:p>
         </w:tc>
@@ -15027,7 +15052,7 @@
           <w:sz w:val="26"/>
           <w:szCs w:val="26"/>
         </w:rPr>
-        <w:t xml:space="preserve">3.9 Internationalisation — 5 Langues</w:t>
+        <w:t xml:space="preserve">3.9 Internationalisation — 4 Langues</w:t>
       </w:r>
     </w:p>
     <w:tbl>
@@ -15739,7 +15764,7 @@
                 <w:sz w:val="20"/>
                 <w:szCs w:val="20"/>
               </w:rPr>
-              <w:t xml:space="preserve">Bariba</w:t>
+              <w:t xml:space="preserve">Yorùbá</w:t>
             </w:r>
           </w:p>
         </w:tc>
@@ -15771,7 +15796,7 @@
                 <w:sz w:val="20"/>
                 <w:szCs w:val="20"/>
               </w:rPr>
-              <w:t xml:space="preserve">baa</w:t>
+              <w:t xml:space="preserve">yor</w:t>
             </w:r>
           </w:p>
         </w:tc>
@@ -15868,168 +15893,6 @@
                 <w:szCs w:val="20"/>
               </w:rPr>
               <w:t xml:space="preserve">P2</w:t>
-            </w:r>
-          </w:p>
-        </w:tc>
-      </w:tr>
-      <w:tr>
-        <w:tc>
-          <w:tcPr>
-            <w:tcW w:type="dxa" w:w="1800"/>
-            <w:tcBorders>
-              <w:top w:val="single" w:color="CCCCCC" w:sz="1"/>
-              <w:left w:val="single" w:color="CCCCCC" w:sz="1"/>
-              <w:bottom w:val="single" w:color="CCCCCC" w:sz="1"/>
-              <w:right w:val="single" w:color="CCCCCC" w:sz="1"/>
-            </w:tcBorders>
-            <w:shd w:fill="FFFFFF" w:val="clear"/>
-            <w:tcMar>
-              <w:top w:type="dxa" w:w="100"/>
-              <w:left w:type="dxa" w:w="160"/>
-              <w:bottom w:type="dxa" w:w="100"/>
-              <w:right w:type="dxa" w:w="160"/>
-            </w:tcMar>
-            <w:vAlign w:val="top"/>
-          </w:tcPr>
-          <w:p>
-            <w:pPr>
-              <w:spacing w:after="0" w:before="0"/>
-            </w:pPr>
-            <w:r>
-              <w:rPr>
-                <w:rFonts w:ascii="Arial" w:cs="Arial" w:eastAsia="Arial" w:hAnsi="Arial"/>
-                <w:sz w:val="20"/>
-                <w:szCs w:val="20"/>
-              </w:rPr>
-              <w:t xml:space="preserve">Dendi</w:t>
-            </w:r>
-          </w:p>
-        </w:tc>
-        <w:tc>
-          <w:tcPr>
-            <w:tcW w:type="dxa" w:w="1200"/>
-            <w:tcBorders>
-              <w:top w:val="single" w:color="CCCCCC" w:sz="1"/>
-              <w:left w:val="single" w:color="CCCCCC" w:sz="1"/>
-              <w:bottom w:val="single" w:color="CCCCCC" w:sz="1"/>
-              <w:right w:val="single" w:color="CCCCCC" w:sz="1"/>
-            </w:tcBorders>
-            <w:shd w:fill="FFFFFF" w:val="clear"/>
-            <w:tcMar>
-              <w:top w:type="dxa" w:w="100"/>
-              <w:left w:type="dxa" w:w="160"/>
-              <w:bottom w:type="dxa" w:w="100"/>
-              <w:right w:type="dxa" w:w="160"/>
-            </w:tcMar>
-            <w:vAlign w:val="top"/>
-          </w:tcPr>
-          <w:p>
-            <w:pPr>
-              <w:spacing w:after="0" w:before="0"/>
-            </w:pPr>
-            <w:r>
-              <w:rPr>
-                <w:rFonts w:ascii="Arial" w:cs="Arial" w:eastAsia="Arial" w:hAnsi="Arial"/>
-                <w:sz w:val="20"/>
-                <w:szCs w:val="20"/>
-              </w:rPr>
-              <w:t xml:space="preserve">ddn</w:t>
-            </w:r>
-          </w:p>
-        </w:tc>
-        <w:tc>
-          <w:tcPr>
-            <w:tcW w:type="dxa" w:w="1600"/>
-            <w:tcBorders>
-              <w:top w:val="single" w:color="CCCCCC" w:sz="1"/>
-              <w:left w:val="single" w:color="CCCCCC" w:sz="1"/>
-              <w:bottom w:val="single" w:color="CCCCCC" w:sz="1"/>
-              <w:right w:val="single" w:color="CCCCCC" w:sz="1"/>
-            </w:tcBorders>
-            <w:shd w:fill="FFFFFF" w:val="clear"/>
-            <w:tcMar>
-              <w:top w:type="dxa" w:w="100"/>
-              <w:left w:type="dxa" w:w="160"/>
-              <w:bottom w:type="dxa" w:w="100"/>
-              <w:right w:type="dxa" w:w="160"/>
-            </w:tcMar>
-            <w:vAlign w:val="top"/>
-          </w:tcPr>
-          <w:p>
-            <w:pPr>
-              <w:spacing w:after="0" w:before="0"/>
-            </w:pPr>
-            <w:r>
-              <w:rPr>
-                <w:rFonts w:ascii="Arial" w:cs="Arial" w:eastAsia="Arial" w:hAnsi="Arial"/>
-                <w:sz w:val="20"/>
-                <w:szCs w:val="20"/>
-              </w:rPr>
-              <w:t xml:space="preserve">Latine adaptée</w:t>
-            </w:r>
-          </w:p>
-        </w:tc>
-        <w:tc>
-          <w:tcPr>
-            <w:tcW w:type="dxa" w:w="2500"/>
-            <w:tcBorders>
-              <w:top w:val="single" w:color="CCCCCC" w:sz="1"/>
-              <w:left w:val="single" w:color="CCCCCC" w:sz="1"/>
-              <w:bottom w:val="single" w:color="CCCCCC" w:sz="1"/>
-              <w:right w:val="single" w:color="CCCCCC" w:sz="1"/>
-            </w:tcBorders>
-            <w:shd w:fill="FFFFFF" w:val="clear"/>
-            <w:tcMar>
-              <w:top w:type="dxa" w:w="100"/>
-              <w:left w:type="dxa" w:w="160"/>
-              <w:bottom w:type="dxa" w:w="100"/>
-              <w:right w:type="dxa" w:w="160"/>
-            </w:tcMar>
-            <w:vAlign w:val="top"/>
-          </w:tcPr>
-          <w:p>
-            <w:pPr>
-              <w:spacing w:after="0" w:before="0"/>
-            </w:pPr>
-            <w:r>
-              <w:rPr>
-                <w:rFonts w:ascii="Arial" w:cs="Arial" w:eastAsia="Arial" w:hAnsi="Arial"/>
-                <w:sz w:val="20"/>
-                <w:szCs w:val="20"/>
-              </w:rPr>
-              <w:t xml:space="preserve">UI principale + alertes critiques</w:t>
-            </w:r>
-          </w:p>
-        </w:tc>
-        <w:tc>
-          <w:tcPr>
-            <w:tcW w:type="dxa" w:w="2260"/>
-            <w:tcBorders>
-              <w:top w:val="single" w:color="CCCCCC" w:sz="1"/>
-              <w:left w:val="single" w:color="CCCCCC" w:sz="1"/>
-              <w:bottom w:val="single" w:color="CCCCCC" w:sz="1"/>
-              <w:right w:val="single" w:color="CCCCCC" w:sz="1"/>
-            </w:tcBorders>
-            <w:shd w:fill="FFFFFF" w:val="clear"/>
-            <w:tcMar>
-              <w:top w:type="dxa" w:w="100"/>
-              <w:left w:type="dxa" w:w="160"/>
-              <w:bottom w:type="dxa" w:w="100"/>
-              <w:right w:type="dxa" w:w="160"/>
-            </w:tcMar>
-            <w:vAlign w:val="top"/>
-          </w:tcPr>
-          <w:p>
-            <w:pPr>
-              <w:spacing w:after="0" w:before="0"/>
-            </w:pPr>
-            <w:r>
-              <w:rPr>
-                <w:rFonts w:ascii="Arial" w:cs="Arial" w:eastAsia="Arial" w:hAnsi="Arial"/>
-                <w:sz w:val="20"/>
-                <w:szCs w:val="20"/>
-              </w:rPr>
-              <w:t xml:space="preserve">P3</w:t>
             </w:r>
           </w:p>
         </w:tc>
@@ -26433,7 +26296,7 @@
                 <w:sz w:val="20"/>
                 <w:szCs w:val="20"/>
               </w:rPr>
-              <w:t xml:space="preserve">Développement frontend PWA (Next.js 14, Tailwind, 5 langues)</w:t>
+              <w:t xml:space="preserve">Développement frontend PWA (Next.js 14, Tailwind, 4 langues)</w:t>
             </w:r>
           </w:p>
         </w:tc>
@@ -33895,7 +33758,7 @@
                 <w:sz w:val="20"/>
                 <w:szCs w:val="20"/>
               </w:rPr>
-              <w:t xml:space="preserve">5 langues × UI critique</w:t>
+              <w:t xml:space="preserve">4 langues × UI critique</w:t>
             </w:r>
           </w:p>
         </w:tc>

</xml_diff>